<commit_message>
Add validation section (dDDH, mapping rate, phylogenomic tree) to thesis doc
Folds in the three low-cost bioinformatic validation results: GGDC dDDH
against the tied top-3 strains, samtools flagstat mapping-rate analysis
with the plasmid-content hypothesis for the observed gap, and the
Mashtree phylogenomic tree (embedded as Figure 1) showing 100% bootstrap
support for the isolate's placement within the BL-09/J25TS1/DSM 28591
clade. Conclusion updated to reflect the three-method convergence.

Co-Authored-By: Claude Sonnet 5 <noreply@anthropic.com>
Claude-Session: https://claude.ai/code/session_01SUbvngJ9dGh9JCmyTh8UeD
</commit_message>
<xml_diff>
--- a/Bacillus_paralicheniformis_Methods_Results_Conclusion.docx
+++ b/Bacillus_paralicheniformis_Methods_Results_Conclusion.docx
@@ -785,15 +785,499 @@
         <w:spacing w:after="120" w:before="240"/>
       </w:pPr>
       <w:r>
-        <w:t xml:space="preserve">5. Conclusion</w:t>
-      </w:r>
-    </w:p>
-    <w:p>
-      <w:pPr>
-        <w:spacing w:after="160"/>
-      </w:pPr>
-      <w:r>
-        <w:t xml:space="preserve">Reference-based genomic analysis, using paired-end Illumina data (19.1 million reads, 2.9 Gb, Q30 = 97.72%) provided by Novogene, identified the isolate as Bacillus paralicheniformis, correcting an initial working assumption of B. licheniformis that a single-reference BLAST comparison alone had failed to distinguish. Within B. paralicheniformis, the isolate's closest relatives among currently deposited genomes form a tight clade of three strains (BL-09, J25TS1, DSM 28591) at ~99.7% ANI, with no single exact match identified. The entirely reference-based workflow — avoiding de novo assembly — proved sufficient to reach genome-scale species and strain-level resolution within the available computational budget, producing a 4.38 Mb consensus genome with internally consistent quality metrics (GC content, depth, Ts/Tv ratio) at every stage.</w:t>
+        <w:t xml:space="preserve">5. Additional bioinformatic validation</w:t>
+      </w:r>
+    </w:p>
+    <w:p>
+      <w:pPr>
+        <w:spacing w:after="160"/>
+      </w:pPr>
+      <w:r>
+        <w:t xml:space="preserve">Given that ANI could not resolve a single closest strain among BL-09, J25TS1, and DSM 28591 (§4.3), three independent, low-cost bioinformatic methods were applied to corroborate the species assignment and further characterize the isolate's placement: digital DNA-DNA hybridization, read mapping rate, and a bootstrap-supported phylogenetic tree.</w:t>
+      </w:r>
+    </w:p>
+    <w:p>
+      <w:pPr>
+        <w:pStyle w:val="Heading2"/>
+        <w:spacing w:after="120" w:before="240"/>
+      </w:pPr>
+      <w:r>
+        <w:t xml:space="preserve">5.1 Digital DNA-DNA hybridization (dDDH)</w:t>
+      </w:r>
+    </w:p>
+    <w:p>
+      <w:pPr>
+        <w:spacing w:after="160"/>
+      </w:pPr>
+      <w:r>
+        <w:t xml:space="preserve">dDDH was computed against the three tied top strains using the DSMZ Genome-to-Genome Distance Calculator (GGDC 3.0). Formula 2 (identities / HSP length), recommended by GGDC when the query is not a fully closed, gap-free assembly, is reported here as the primary value.</w:t>
+      </w:r>
+    </w:p>
+    <w:tbl>
+      <w:tblPr>
+        <w:tblW w:type="dxa" w:w="12000"/>
+        <w:tblBorders>
+          <w:top w:val="single" w:color="auto" w:sz="4"/>
+          <w:left w:val="single" w:color="auto" w:sz="4"/>
+          <w:bottom w:val="single" w:color="auto" w:sz="4"/>
+          <w:right w:val="single" w:color="auto" w:sz="4"/>
+          <w:insideH w:val="single" w:color="auto" w:sz="4"/>
+          <w:insideV w:val="single" w:color="auto" w:sz="4"/>
+        </w:tblBorders>
+      </w:tblPr>
+      <w:tblGrid>
+        <w:gridCol w:w="2200"/>
+        <w:gridCol w:w="2400"/>
+        <w:gridCol w:w="2400"/>
+        <w:gridCol w:w="2400"/>
+        <w:gridCol w:w="2600"/>
+      </w:tblGrid>
+      <w:tr>
+        <w:trPr>
+          <w:tblHeader/>
+        </w:trPr>
+        <w:tc>
+          <w:tcPr>
+            <w:tcW w:type="dxa" w:w="2200"/>
+            <w:shd w:fill="D9D9D9" w:val="clear"/>
+          </w:tcPr>
+          <w:p>
+            <w:r>
+              <w:rPr>
+                <w:b/>
+                <w:bCs/>
+              </w:rPr>
+              <w:t xml:space="preserve">Reference</w:t>
+            </w:r>
+          </w:p>
+        </w:tc>
+        <w:tc>
+          <w:tcPr>
+            <w:tcW w:type="dxa" w:w="2400"/>
+            <w:shd w:fill="D9D9D9" w:val="clear"/>
+          </w:tcPr>
+          <w:p>
+            <w:r>
+              <w:rPr>
+                <w:b/>
+                <w:bCs/>
+              </w:rPr>
+              <w:t xml:space="preserve">dDDH (Formula 2)</w:t>
+            </w:r>
+          </w:p>
+        </w:tc>
+        <w:tc>
+          <w:tcPr>
+            <w:tcW w:type="dxa" w:w="2400"/>
+            <w:shd w:fill="D9D9D9" w:val="clear"/>
+          </w:tcPr>
+          <w:p>
+            <w:r>
+              <w:rPr>
+                <w:b/>
+                <w:bCs/>
+              </w:rPr>
+              <w:t xml:space="preserve">Model C.I.</w:t>
+            </w:r>
+          </w:p>
+        </w:tc>
+        <w:tc>
+          <w:tcPr>
+            <w:tcW w:type="dxa" w:w="2400"/>
+            <w:shd w:fill="D9D9D9" w:val="clear"/>
+          </w:tcPr>
+          <w:p>
+            <w:r>
+              <w:rPr>
+                <w:b/>
+                <w:bCs/>
+              </w:rPr>
+              <w:t xml:space="preserve">Prob. dDDH ≥ 70%</w:t>
+            </w:r>
+          </w:p>
+        </w:tc>
+        <w:tc>
+          <w:tcPr>
+            <w:tcW w:type="dxa" w:w="2600"/>
+            <w:shd w:fill="D9D9D9" w:val="clear"/>
+          </w:tcPr>
+          <w:p>
+            <w:r>
+              <w:rPr>
+                <w:b/>
+                <w:bCs/>
+              </w:rPr>
+              <w:t xml:space="preserve">G+C difference (%)</w:t>
+            </w:r>
+          </w:p>
+        </w:tc>
+      </w:tr>
+      <w:tr>
+        <w:tc>
+          <w:tcPr>
+            <w:tcW w:type="dxa" w:w="2200"/>
+          </w:tcPr>
+          <w:p>
+            <w:r>
+              <w:rPr>
+                <w:b w:val="false"/>
+                <w:bCs w:val="false"/>
+              </w:rPr>
+              <w:t xml:space="preserve">BL-09</w:t>
+            </w:r>
+          </w:p>
+        </w:tc>
+        <w:tc>
+          <w:tcPr>
+            <w:tcW w:type="dxa" w:w="2400"/>
+          </w:tcPr>
+          <w:p>
+            <w:r>
+              <w:rPr>
+                <w:b w:val="false"/>
+                <w:bCs w:val="false"/>
+              </w:rPr>
+              <w:t xml:space="preserve">98.60%</w:t>
+            </w:r>
+          </w:p>
+        </w:tc>
+        <w:tc>
+          <w:tcPr>
+            <w:tcW w:type="dxa" w:w="2400"/>
+          </w:tcPr>
+          <w:p>
+            <w:r>
+              <w:rPr>
+                <w:b w:val="false"/>
+                <w:bCs w:val="false"/>
+              </w:rPr>
+              <w:t xml:space="preserve">[97.9–99.1%]</w:t>
+            </w:r>
+          </w:p>
+        </w:tc>
+        <w:tc>
+          <w:tcPr>
+            <w:tcW w:type="dxa" w:w="2400"/>
+          </w:tcPr>
+          <w:p>
+            <w:r>
+              <w:rPr>
+                <w:b w:val="false"/>
+                <w:bCs w:val="false"/>
+              </w:rPr>
+              <w:t xml:space="preserve">97.98%</w:t>
+            </w:r>
+          </w:p>
+        </w:tc>
+        <w:tc>
+          <w:tcPr>
+            <w:tcW w:type="dxa" w:w="2600"/>
+          </w:tcPr>
+          <w:p>
+            <w:r>
+              <w:rPr>
+                <w:b w:val="false"/>
+                <w:bCs w:val="false"/>
+              </w:rPr>
+              <w:t xml:space="preserve">0.03</w:t>
+            </w:r>
+          </w:p>
+        </w:tc>
+      </w:tr>
+      <w:tr>
+        <w:tc>
+          <w:tcPr>
+            <w:tcW w:type="dxa" w:w="2200"/>
+          </w:tcPr>
+          <w:p>
+            <w:r>
+              <w:rPr>
+                <w:b w:val="false"/>
+                <w:bCs w:val="false"/>
+              </w:rPr>
+              <w:t xml:space="preserve">J25TS1</w:t>
+            </w:r>
+          </w:p>
+        </w:tc>
+        <w:tc>
+          <w:tcPr>
+            <w:tcW w:type="dxa" w:w="2400"/>
+          </w:tcPr>
+          <w:p>
+            <w:r>
+              <w:rPr>
+                <w:b w:val="false"/>
+                <w:bCs w:val="false"/>
+              </w:rPr>
+              <w:t xml:space="preserve">98.60%</w:t>
+            </w:r>
+          </w:p>
+        </w:tc>
+        <w:tc>
+          <w:tcPr>
+            <w:tcW w:type="dxa" w:w="2400"/>
+          </w:tcPr>
+          <w:p>
+            <w:r>
+              <w:rPr>
+                <w:b w:val="false"/>
+                <w:bCs w:val="false"/>
+              </w:rPr>
+              <w:t xml:space="preserve">[97.9–99%]</w:t>
+            </w:r>
+          </w:p>
+        </w:tc>
+        <w:tc>
+          <w:tcPr>
+            <w:tcW w:type="dxa" w:w="2400"/>
+          </w:tcPr>
+          <w:p>
+            <w:r>
+              <w:rPr>
+                <w:b w:val="false"/>
+                <w:bCs w:val="false"/>
+              </w:rPr>
+              <w:t xml:space="preserve">97.98%</w:t>
+            </w:r>
+          </w:p>
+        </w:tc>
+        <w:tc>
+          <w:tcPr>
+            <w:tcW w:type="dxa" w:w="2600"/>
+          </w:tcPr>
+          <w:p>
+            <w:r>
+              <w:rPr>
+                <w:b w:val="false"/>
+                <w:bCs w:val="false"/>
+              </w:rPr>
+              <w:t xml:space="preserve">0.04</w:t>
+            </w:r>
+          </w:p>
+        </w:tc>
+      </w:tr>
+      <w:tr>
+        <w:tc>
+          <w:tcPr>
+            <w:tcW w:type="dxa" w:w="2200"/>
+          </w:tcPr>
+          <w:p>
+            <w:r>
+              <w:rPr>
+                <w:b w:val="false"/>
+                <w:bCs w:val="false"/>
+              </w:rPr>
+              <w:t xml:space="preserve">DSM 28591</w:t>
+            </w:r>
+          </w:p>
+        </w:tc>
+        <w:tc>
+          <w:tcPr>
+            <w:tcW w:type="dxa" w:w="2400"/>
+          </w:tcPr>
+          <w:p>
+            <w:r>
+              <w:rPr>
+                <w:b w:val="false"/>
+                <w:bCs w:val="false"/>
+              </w:rPr>
+              <w:t xml:space="preserve">98.60%</w:t>
+            </w:r>
+          </w:p>
+        </w:tc>
+        <w:tc>
+          <w:tcPr>
+            <w:tcW w:type="dxa" w:w="2400"/>
+          </w:tcPr>
+          <w:p>
+            <w:r>
+              <w:rPr>
+                <w:b w:val="false"/>
+                <w:bCs w:val="false"/>
+              </w:rPr>
+              <w:t xml:space="preserve">[97.9–99%]</w:t>
+            </w:r>
+          </w:p>
+        </w:tc>
+        <w:tc>
+          <w:tcPr>
+            <w:tcW w:type="dxa" w:w="2400"/>
+          </w:tcPr>
+          <w:p>
+            <w:r>
+              <w:rPr>
+                <w:b w:val="false"/>
+                <w:bCs w:val="false"/>
+              </w:rPr>
+              <w:t xml:space="preserve">97.97%</w:t>
+            </w:r>
+          </w:p>
+        </w:tc>
+        <w:tc>
+          <w:tcPr>
+            <w:tcW w:type="dxa" w:w="2600"/>
+          </w:tcPr>
+          <w:p>
+            <w:r>
+              <w:rPr>
+                <w:b w:val="false"/>
+                <w:bCs w:val="false"/>
+              </w:rPr>
+              <w:t xml:space="preserve">0.04</w:t>
+            </w:r>
+          </w:p>
+        </w:tc>
+      </w:tr>
+    </w:tbl>
+    <w:p>
+      <w:pPr>
+        <w:spacing w:after="160"/>
+      </w:pPr>
+      <w:r>
+        <w:t xml:space="preserve"/>
+      </w:r>
+    </w:p>
+    <w:p>
+      <w:pPr>
+        <w:spacing w:after="160"/>
+      </w:pPr>
+      <w:r>
+        <w:t xml:space="preserve">dDDH values are far above the 70% species-delimitation threshold, with near-certain probability of exceeding it (97.97–97.98%), and G+C content differences are negligible (0.03–0.04%). Both results independently corroborate the species assignment via a method unrelated to ANI's underlying algorithm. As expected, dDDH did not resolve the three-way tie: values are effectively identical across all three reference strains, consistent with dDDH being a species/subspecies-boundary metric rather than a fine-grained strain discriminator.</w:t>
+      </w:r>
+    </w:p>
+    <w:p>
+      <w:pPr>
+        <w:pStyle w:val="Heading2"/>
+        <w:spacing w:after="120" w:before="240"/>
+      </w:pPr>
+      <w:r>
+        <w:t xml:space="preserve">5.2 Read mapping rate</w:t>
+      </w:r>
+    </w:p>
+    <w:p>
+      <w:pPr>
+        <w:spacing w:after="160"/>
+      </w:pPr>
+      <w:r>
+        <w:t xml:space="preserve">Alignment statistics for the corrected mapping (§3.5) were assessed with samtools flagstat. Of 19,140,539 total reads (19,111,538 primary), 90.72% mapped overall (90.71% of primary reads), with 89.93% properly paired and 0.32% singletons; no reads had a mate mapped to a different contig.</w:t>
+      </w:r>
+    </w:p>
+    <w:p>
+      <w:pPr>
+        <w:spacing w:after="160"/>
+      </w:pPr>
+      <w:r>
+        <w:t xml:space="preserve">This mapping rate is supportive of, but lower than ideally expected for, the species assignment: a reference at 99.3% ANI to the isolate (Bac84) would typically be expected to yield a mapping rate above 95%. The most parsimonious explanation is that the Bac84 reference record used for mapping is annotated as chromosome-only (no plasmid sequence), while B. paralicheniformis commonly carries plasmids; isolate reads originating from plasmid DNA absent in this reference would be unable to map, plausibly accounting for a meaningful share of the unmapped ~9%. Low-level sample contamination remains a secondary, untested possibility, as no taxonomic classification (e.g., Kraken2, sourmash) was run directly on the raw reads in this workflow. This is noted here as an explicit, testable limitation rather than treated as resolved.</w:t>
+      </w:r>
+    </w:p>
+    <w:p>
+      <w:pPr>
+        <w:pStyle w:val="Heading2"/>
+        <w:spacing w:after="120" w:before="240"/>
+      </w:pPr>
+      <w:r>
+        <w:t xml:space="preserve">5.3 Phylogenomic tree</w:t>
+      </w:r>
+    </w:p>
+    <w:p>
+      <w:pPr>
+        <w:spacing w:after="160"/>
+      </w:pPr>
+      <w:r>
+        <w:t xml:space="preserve">A neighbor-joining tree based on Mash distances was constructed with Mashtree (100 bootstrap replicates) from the corrected consensus genome and the 25 complete B. paralicheniformis assemblies used in the strain-level ANI ranking (§3.6).</w:t>
+      </w:r>
+    </w:p>
+    <w:p>
+      <w:pPr>
+        <w:spacing w:after="80" w:before="120"/>
+        <w:jc w:val="center"/>
+      </w:pPr>
+      <w:r>
+        <w:drawing>
+          <wp:inline distT="0" distB="0" distL="0" distR="0">
+            <wp:extent cx="5715000" cy="4438650"/>
+            <wp:effectExtent t="0" r="0" b="0" l="0"/>
+            <wp:docPr id="1" name="" descr="" title=""/>
+            <wp:cNvGraphicFramePr>
+              <a:graphicFrameLocks xmlns:a="http://schemas.openxmlformats.org/drawingml/2006/main" noChangeAspect="1"/>
+            </wp:cNvGraphicFramePr>
+            <a:graphic xmlns:a="http://schemas.openxmlformats.org/drawingml/2006/main">
+              <a:graphicData uri="http://schemas.openxmlformats.org/drawingml/2006/picture">
+                <pic:pic xmlns:pic="http://schemas.openxmlformats.org/drawingml/2006/picture">
+                  <pic:nvPicPr>
+                    <pic:cNvPr id="0" name="" descr=""/>
+                    <pic:cNvPicPr>
+                      <a:picLocks noChangeAspect="1" noChangeArrowheads="1"/>
+                    </pic:cNvPicPr>
+                  </pic:nvPicPr>
+                  <pic:blipFill>
+                    <a:blip r:embed="rId7" cstate="none"/>
+                    <a:srcRect/>
+                    <a:stretch>
+                      <a:fillRect/>
+                    </a:stretch>
+                  </pic:blipFill>
+                  <pic:spPr bwMode="auto">
+                    <a:xfrm>
+                      <a:off x="0" y="0"/>
+                      <a:ext cx="5715000" cy="4438650"/>
+                    </a:xfrm>
+                    <a:prstGeom prst="rect">
+                      <a:avLst/>
+                    </a:prstGeom>
+                  </pic:spPr>
+                </pic:pic>
+              </a:graphicData>
+            </a:graphic>
+          </wp:inline>
+        </w:drawing>
+      </w:r>
+    </w:p>
+    <w:p>
+      <w:pPr>
+        <w:spacing w:after="160"/>
+      </w:pPr>
+      <w:r>
+        <w:rPr>
+          <w:i/>
+          <w:iCs/>
+          <w:sz w:val="18"/>
+          <w:szCs w:val="18"/>
+        </w:rPr>
+        <w:t xml:space="preserve">Figure 1. Mashtree neighbor-joining tree (Mash distances, 100 bootstrap replicates). The isolate (red) is highlighted among B. paralicheniformis reference genomes.</w:t>
+      </w:r>
+    </w:p>
+    <w:p>
+      <w:pPr>
+        <w:spacing w:after="160"/>
+      </w:pPr>
+      <w:r>
+        <w:t xml:space="preserve"/>
+      </w:r>
+    </w:p>
+    <w:p>
+      <w:pPr>
+        <w:spacing w:after="160"/>
+      </w:pPr>
+      <w:r>
+        <w:t xml:space="preserve">The isolate formed a clade with BL-09, J25TS1, and DSM 28591 at 100% bootstrap support — a statistically robust, independent confirmation (via tree topology rather than pairwise identity) that the isolate belongs with exactly the three strains flagged as tied by ANI. Internal resolution within that clade was weak: the branch separating DSM 28591+J25TS1 from BL-09 received only 56% bootstrap support, so the tree — like ANI and dDDH — does not identify a single closest strain. Separately, strain CamBx3 (GCA_026210435.1) showed by far the longest branch in the tree (Mash distance 0.0218, roughly an order of magnitude greater than any other branch), corroborating its identification as a clear outlier in the ANI ranking (96.72%, §4.3) via an independent method.</w:t>
+      </w:r>
+    </w:p>
+    <w:p>
+      <w:pPr>
+        <w:pStyle w:val="Heading1"/>
+        <w:spacing w:after="120" w:before="240"/>
+      </w:pPr>
+      <w:r>
+        <w:t xml:space="preserve">6. Conclusion</w:t>
+      </w:r>
+    </w:p>
+    <w:p>
+      <w:pPr>
+        <w:spacing w:after="160"/>
+      </w:pPr>
+      <w:r>
+        <w:t xml:space="preserve">Reference-based genomic analysis, using paired-end Illumina data (19.1 million reads, 2.9 Gb, Q30 = 97.72%) provided by Novogene, identified the isolate as Bacillus paralicheniformis, correcting an initial working assumption of B. licheniformis that a single-reference BLAST comparison alone had failed to distinguish. Within B. paralicheniformis, the isolate's closest relatives among currently deposited genomes form a tight clade of three strains (BL-09, J25TS1, DSM 28591) at ~99.7% ANI, with no single exact match identified. Three independent, low-cost validation methods — digital DNA-DNA hybridization, read mapping rate, and a bootstrap-supported phylogenomic tree — converge on the same conclusion: strong, multi-method support for the species assignment and for this specific three-strain clade, with consistent inability across all three methods to resolve a single closest strain within it. This convergence, including a shared limitation, is itself evidence of a robust rather than coincidental result. One open, explicitly flagged limitation — a lower-than-ideal read mapping rate, plausibly attributable to isolate-specific plasmid content absent from the chromosome-only mapping reference — remains for future work. The entirely reference-based workflow — avoiding de novo assembly — proved sufficient to reach genome-scale species and strain-level resolution within the available computational budget, producing a 4.38 Mb consensus genome with internally consistent quality metrics (GC content, depth, Ts/Tv ratio) at every stage.</w:t>
       </w:r>
     </w:p>
     <w:sectPr>

</xml_diff>

<commit_message>
Add BGC content validation (antiSMASH) section to thesis doc
Adds section 5.4 comparing bacitracin, fengycin, and lanthipeptide-class-ii
biosynthetic gene clusters across the isolate, the Bac84 mapping reference,
and the three tied top strains. Bacitracin and fengycin are confirmed at
high confidence in all five genomes. The lanthipeptide cluster present in
all three reference strains is absent from both the isolate consensus and
the Bac84 reference itself, so this is documented explicitly as a
methodological blind spot of the reference-based consensus approach
(bcftools consensus cannot introduce sequence absent from its backbone),
not as evidence the isolate lacks the trait. Conclusion updated to name
both open limitations (mapping rate, this BGC gap) and their shared cause.

Co-Authored-By: Claude Sonnet 5 <noreply@anthropic.com>
Claude-Session: https://claude.ai/code/session_01SUbvngJ9dGh9JCmyTh8UeD
</commit_message>
<xml_diff>
--- a/Bacillus_paralicheniformis_Methods_Results_Conclusion.docx
+++ b/Bacillus_paralicheniformis_Methods_Results_Conclusion.docx
@@ -793,7 +793,7 @@
         <w:spacing w:after="160"/>
       </w:pPr>
       <w:r>
-        <w:t xml:space="preserve">Given that ANI could not resolve a single closest strain among BL-09, J25TS1, and DSM 28591 (§4.3), three independent, low-cost bioinformatic methods were applied to corroborate the species assignment and further characterize the isolate's placement: digital DNA-DNA hybridization, read mapping rate, and a bootstrap-supported phylogenetic tree.</w:t>
+        <w:t xml:space="preserve">Given that ANI could not resolve a single closest strain among BL-09, J25TS1, and DSM 28591 (§4.3), four independent, low-cost bioinformatic methods were applied to corroborate the species assignment and further characterize the isolate's placement: digital DNA-DNA hybridization, read mapping rate, a bootstrap-supported phylogenetic tree, and secondary metabolite biosynthetic gene cluster (BGC) content.</w:t>
       </w:r>
     </w:p>
     <w:p>
@@ -1265,6 +1265,421 @@
     </w:p>
     <w:p>
       <w:pPr>
+        <w:pStyle w:val="Heading2"/>
+        <w:spacing w:after="120" w:before="240"/>
+      </w:pPr>
+      <w:r>
+        <w:t xml:space="preserve">5.4 Secondary metabolite biosynthetic gene cluster (BGC) content</w:t>
+      </w:r>
+    </w:p>
+    <w:p>
+      <w:pPr>
+        <w:spacing w:after="160"/>
+      </w:pPr>
+      <w:r>
+        <w:t xml:space="preserve">Biosynthetic gene clusters were annotated with antiSMASH (bacterial mode, KnownClusterBlast enabled) for the isolate consensus, the Bac84 mapping reference, and the three tied top strains (BL-09, J25TS1, DSM 28591), focusing on three compounds reported for B. paralicheniformis: bacitracin, fengycin, and a class-II lanthipeptide.</w:t>
+      </w:r>
+    </w:p>
+    <w:tbl>
+      <w:tblPr>
+        <w:tblW w:type="dxa" w:w="9700"/>
+        <w:tblBorders>
+          <w:top w:val="single" w:color="auto" w:sz="4"/>
+          <w:left w:val="single" w:color="auto" w:sz="4"/>
+          <w:bottom w:val="single" w:color="auto" w:sz="4"/>
+          <w:right w:val="single" w:color="auto" w:sz="4"/>
+          <w:insideH w:val="single" w:color="auto" w:sz="4"/>
+          <w:insideV w:val="single" w:color="auto" w:sz="4"/>
+        </w:tblBorders>
+      </w:tblPr>
+      <w:tblGrid>
+        <w:gridCol w:w="2600"/>
+        <w:gridCol w:w="1300"/>
+        <w:gridCol w:w="1700"/>
+        <w:gridCol w:w="1300"/>
+        <w:gridCol w:w="1500"/>
+        <w:gridCol w:w="1300"/>
+      </w:tblGrid>
+      <w:tr>
+        <w:trPr>
+          <w:tblHeader/>
+        </w:trPr>
+        <w:tc>
+          <w:tcPr>
+            <w:tcW w:type="dxa" w:w="2600"/>
+            <w:shd w:fill="D9D9D9" w:val="clear"/>
+          </w:tcPr>
+          <w:p>
+            <w:r>
+              <w:rPr>
+                <w:b/>
+                <w:bCs/>
+              </w:rPr>
+              <w:t xml:space="preserve">Compound</w:t>
+            </w:r>
+          </w:p>
+        </w:tc>
+        <w:tc>
+          <w:tcPr>
+            <w:tcW w:type="dxa" w:w="1300"/>
+            <w:shd w:fill="D9D9D9" w:val="clear"/>
+          </w:tcPr>
+          <w:p>
+            <w:r>
+              <w:rPr>
+                <w:b/>
+                <w:bCs/>
+              </w:rPr>
+              <w:t xml:space="preserve">Isolate</w:t>
+            </w:r>
+          </w:p>
+        </w:tc>
+        <w:tc>
+          <w:tcPr>
+            <w:tcW w:type="dxa" w:w="1700"/>
+            <w:shd w:fill="D9D9D9" w:val="clear"/>
+          </w:tcPr>
+          <w:p>
+            <w:r>
+              <w:rPr>
+                <w:b/>
+                <w:bCs/>
+              </w:rPr>
+              <w:t xml:space="preserve">Bac84 (mapping ref.)</w:t>
+            </w:r>
+          </w:p>
+        </w:tc>
+        <w:tc>
+          <w:tcPr>
+            <w:tcW w:type="dxa" w:w="1300"/>
+            <w:shd w:fill="D9D9D9" w:val="clear"/>
+          </w:tcPr>
+          <w:p>
+            <w:r>
+              <w:rPr>
+                <w:b/>
+                <w:bCs/>
+              </w:rPr>
+              <w:t xml:space="preserve">BL-09</w:t>
+            </w:r>
+          </w:p>
+        </w:tc>
+        <w:tc>
+          <w:tcPr>
+            <w:tcW w:type="dxa" w:w="1500"/>
+            <w:shd w:fill="D9D9D9" w:val="clear"/>
+          </w:tcPr>
+          <w:p>
+            <w:r>
+              <w:rPr>
+                <w:b/>
+                <w:bCs/>
+              </w:rPr>
+              <w:t xml:space="preserve">DSM 28591</w:t>
+            </w:r>
+          </w:p>
+        </w:tc>
+        <w:tc>
+          <w:tcPr>
+            <w:tcW w:type="dxa" w:w="1300"/>
+            <w:shd w:fill="D9D9D9" w:val="clear"/>
+          </w:tcPr>
+          <w:p>
+            <w:r>
+              <w:rPr>
+                <w:b/>
+                <w:bCs/>
+              </w:rPr>
+              <w:t xml:space="preserve">J25TS1</w:t>
+            </w:r>
+          </w:p>
+        </w:tc>
+      </w:tr>
+      <w:tr>
+        <w:tc>
+          <w:tcPr>
+            <w:tcW w:type="dxa" w:w="2600"/>
+          </w:tcPr>
+          <w:p>
+            <w:r>
+              <w:rPr>
+                <w:b w:val="false"/>
+                <w:bCs w:val="false"/>
+              </w:rPr>
+              <w:t xml:space="preserve">Bacitracin (NRPS)</w:t>
+            </w:r>
+          </w:p>
+        </w:tc>
+        <w:tc>
+          <w:tcPr>
+            <w:tcW w:type="dxa" w:w="1300"/>
+          </w:tcPr>
+          <w:p>
+            <w:r>
+              <w:rPr>
+                <w:b w:val="false"/>
+                <w:bCs w:val="false"/>
+              </w:rPr>
+              <w:t xml:space="preserve">High</w:t>
+            </w:r>
+          </w:p>
+        </w:tc>
+        <w:tc>
+          <w:tcPr>
+            <w:tcW w:type="dxa" w:w="1700"/>
+          </w:tcPr>
+          <w:p>
+            <w:r>
+              <w:rPr>
+                <w:b w:val="false"/>
+                <w:bCs w:val="false"/>
+              </w:rPr>
+              <w:t xml:space="preserve">High</w:t>
+            </w:r>
+          </w:p>
+        </w:tc>
+        <w:tc>
+          <w:tcPr>
+            <w:tcW w:type="dxa" w:w="1300"/>
+          </w:tcPr>
+          <w:p>
+            <w:r>
+              <w:rPr>
+                <w:b w:val="false"/>
+                <w:bCs w:val="false"/>
+              </w:rPr>
+              <w:t xml:space="preserve">High</w:t>
+            </w:r>
+          </w:p>
+        </w:tc>
+        <w:tc>
+          <w:tcPr>
+            <w:tcW w:type="dxa" w:w="1500"/>
+          </w:tcPr>
+          <w:p>
+            <w:r>
+              <w:rPr>
+                <w:b w:val="false"/>
+                <w:bCs w:val="false"/>
+              </w:rPr>
+              <w:t xml:space="preserve">High</w:t>
+            </w:r>
+          </w:p>
+        </w:tc>
+        <w:tc>
+          <w:tcPr>
+            <w:tcW w:type="dxa" w:w="1300"/>
+          </w:tcPr>
+          <w:p>
+            <w:r>
+              <w:rPr>
+                <w:b w:val="false"/>
+                <w:bCs w:val="false"/>
+              </w:rPr>
+              <w:t xml:space="preserve">High</w:t>
+            </w:r>
+          </w:p>
+        </w:tc>
+      </w:tr>
+      <w:tr>
+        <w:tc>
+          <w:tcPr>
+            <w:tcW w:type="dxa" w:w="2600"/>
+          </w:tcPr>
+          <w:p>
+            <w:r>
+              <w:rPr>
+                <w:b w:val="false"/>
+                <w:bCs w:val="false"/>
+              </w:rPr>
+              <w:t xml:space="preserve">Fengycin (NRPS+betalactone)</w:t>
+            </w:r>
+          </w:p>
+        </w:tc>
+        <w:tc>
+          <w:tcPr>
+            <w:tcW w:type="dxa" w:w="1300"/>
+          </w:tcPr>
+          <w:p>
+            <w:r>
+              <w:rPr>
+                <w:b w:val="false"/>
+                <w:bCs w:val="false"/>
+              </w:rPr>
+              <w:t xml:space="preserve">High</w:t>
+            </w:r>
+          </w:p>
+        </w:tc>
+        <w:tc>
+          <w:tcPr>
+            <w:tcW w:type="dxa" w:w="1700"/>
+          </w:tcPr>
+          <w:p>
+            <w:r>
+              <w:rPr>
+                <w:b w:val="false"/>
+                <w:bCs w:val="false"/>
+              </w:rPr>
+              <w:t xml:space="preserve">High</w:t>
+            </w:r>
+          </w:p>
+        </w:tc>
+        <w:tc>
+          <w:tcPr>
+            <w:tcW w:type="dxa" w:w="1300"/>
+          </w:tcPr>
+          <w:p>
+            <w:r>
+              <w:rPr>
+                <w:b w:val="false"/>
+                <w:bCs w:val="false"/>
+              </w:rPr>
+              <w:t xml:space="preserve">High</w:t>
+            </w:r>
+          </w:p>
+        </w:tc>
+        <w:tc>
+          <w:tcPr>
+            <w:tcW w:type="dxa" w:w="1500"/>
+          </w:tcPr>
+          <w:p>
+            <w:r>
+              <w:rPr>
+                <w:b w:val="false"/>
+                <w:bCs w:val="false"/>
+              </w:rPr>
+              <w:t xml:space="preserve">High</w:t>
+            </w:r>
+          </w:p>
+        </w:tc>
+        <w:tc>
+          <w:tcPr>
+            <w:tcW w:type="dxa" w:w="1300"/>
+          </w:tcPr>
+          <w:p>
+            <w:r>
+              <w:rPr>
+                <w:b w:val="false"/>
+                <w:bCs w:val="false"/>
+              </w:rPr>
+              <w:t xml:space="preserve">High</w:t>
+            </w:r>
+          </w:p>
+        </w:tc>
+      </w:tr>
+      <w:tr>
+        <w:tc>
+          <w:tcPr>
+            <w:tcW w:type="dxa" w:w="2600"/>
+          </w:tcPr>
+          <w:p>
+            <w:r>
+              <w:rPr>
+                <w:b w:val="false"/>
+                <w:bCs w:val="false"/>
+              </w:rPr>
+              <w:t xml:space="preserve">Lanthipeptide-class-ii (amyloliquecidin GF610)</w:t>
+            </w:r>
+          </w:p>
+        </w:tc>
+        <w:tc>
+          <w:tcPr>
+            <w:tcW w:type="dxa" w:w="1300"/>
+          </w:tcPr>
+          <w:p>
+            <w:r>
+              <w:rPr>
+                <w:b w:val="false"/>
+                <w:bCs w:val="false"/>
+              </w:rPr>
+              <w:t xml:space="preserve">Not recoverable</w:t>
+            </w:r>
+          </w:p>
+        </w:tc>
+        <w:tc>
+          <w:tcPr>
+            <w:tcW w:type="dxa" w:w="1700"/>
+          </w:tcPr>
+          <w:p>
+            <w:r>
+              <w:rPr>
+                <w:b w:val="false"/>
+                <w:bCs w:val="false"/>
+              </w:rPr>
+              <w:t xml:space="preserve">Absent</w:t>
+            </w:r>
+          </w:p>
+        </w:tc>
+        <w:tc>
+          <w:tcPr>
+            <w:tcW w:type="dxa" w:w="1300"/>
+          </w:tcPr>
+          <w:p>
+            <w:r>
+              <w:rPr>
+                <w:b w:val="false"/>
+                <w:bCs w:val="false"/>
+              </w:rPr>
+              <w:t xml:space="preserve">High</w:t>
+            </w:r>
+          </w:p>
+        </w:tc>
+        <w:tc>
+          <w:tcPr>
+            <w:tcW w:type="dxa" w:w="1500"/>
+          </w:tcPr>
+          <w:p>
+            <w:r>
+              <w:rPr>
+                <w:b w:val="false"/>
+                <w:bCs w:val="false"/>
+              </w:rPr>
+              <w:t xml:space="preserve">High</w:t>
+            </w:r>
+          </w:p>
+        </w:tc>
+        <w:tc>
+          <w:tcPr>
+            <w:tcW w:type="dxa" w:w="1300"/>
+          </w:tcPr>
+          <w:p>
+            <w:r>
+              <w:rPr>
+                <w:b w:val="false"/>
+                <w:bCs w:val="false"/>
+              </w:rPr>
+              <w:t xml:space="preserve">High</w:t>
+            </w:r>
+          </w:p>
+        </w:tc>
+      </w:tr>
+    </w:tbl>
+    <w:p>
+      <w:pPr>
+        <w:spacing w:after="160"/>
+      </w:pPr>
+      <w:r>
+        <w:t xml:space="preserve"/>
+      </w:r>
+    </w:p>
+    <w:p>
+      <w:pPr>
+        <w:spacing w:after="160"/>
+      </w:pPr>
+      <w:r>
+        <w:t xml:space="preserve">Bacitracin and fengycin biosynthetic gene clusters were detected at high KnownClusterBlast confidence in all five genomes examined, consistent with (though not independently diagnostic of, since bacitracin biosynthesis is shared across the B. licheniformis/paralicheniformis species complex rather than unique to B. paralicheniformis) the species assignment established in §4.1.</w:t>
+      </w:r>
+    </w:p>
+    <w:p>
+      <w:pPr>
+        <w:spacing w:after="160"/>
+      </w:pPr>
+      <w:r>
+        <w:t xml:space="preserve">The lanthipeptide-class-ii cluster present in all three tied top strains was absent from both the isolate consensus and the Bac84 reference used to construct it, with region architecture otherwise identical (13 matching regions in each, differing only by this one cluster present as a 14th region in the three reference strains). This is treated as a methodological limitation rather than a biological finding: bcftools consensus can only substitute called variants onto the existing reference backbone and cannot introduce a genomic region absent from that backbone. Because Bac84 itself lacks this cluster, the reference-based consensus was structurally unable to recover it regardless of whether the isolate's true genome carries it. This result is therefore reported as inconclusive by design -- a specific, explicitly identified blind spot of the reference-based (non-de-novo) approach adopted throughout this work -- rather than as evidence that the isolate lacks this biosynthetic capacity. Direct confirmation would require either targeted PCR/Sanger sequencing of this locus or local reassembly of the subset of reads left unmapped against Bac84.</w:t>
+      </w:r>
+    </w:p>
+    <w:p>
+      <w:pPr>
         <w:pStyle w:val="Heading1"/>
         <w:spacing w:after="120" w:before="240"/>
       </w:pPr>
@@ -1277,7 +1692,7 @@
         <w:spacing w:after="160"/>
       </w:pPr>
       <w:r>
-        <w:t xml:space="preserve">Reference-based genomic analysis, using paired-end Illumina data (19.1 million reads, 2.9 Gb, Q30 = 97.72%) provided by Novogene, identified the isolate as Bacillus paralicheniformis, correcting an initial working assumption of B. licheniformis that a single-reference BLAST comparison alone had failed to distinguish. Within B. paralicheniformis, the isolate's closest relatives among currently deposited genomes form a tight clade of three strains (BL-09, J25TS1, DSM 28591) at ~99.7% ANI, with no single exact match identified. Three independent, low-cost validation methods — digital DNA-DNA hybridization, read mapping rate, and a bootstrap-supported phylogenomic tree — converge on the same conclusion: strong, multi-method support for the species assignment and for this specific three-strain clade, with consistent inability across all three methods to resolve a single closest strain within it. This convergence, including a shared limitation, is itself evidence of a robust rather than coincidental result. One open, explicitly flagged limitation — a lower-than-ideal read mapping rate, plausibly attributable to isolate-specific plasmid content absent from the chromosome-only mapping reference — remains for future work. The entirely reference-based workflow — avoiding de novo assembly — proved sufficient to reach genome-scale species and strain-level resolution within the available computational budget, producing a 4.38 Mb consensus genome with internally consistent quality metrics (GC content, depth, Ts/Tv ratio) at every stage.</w:t>
+        <w:t xml:space="preserve">Reference-based genomic analysis, using paired-end Illumina data (19.1 million reads, 2.9 Gb, Q30 = 97.72%) provided by Novogene, identified the isolate as Bacillus paralicheniformis, correcting an initial working assumption of B. licheniformis that a single-reference BLAST comparison alone had failed to distinguish. Within B. paralicheniformis, the isolate's closest relatives among currently deposited genomes form a tight clade of three strains (BL-09, J25TS1, DSM 28591) at ~99.7% ANI, with no single exact match identified. Four independent, low-cost validation methods — digital DNA-DNA hybridization, read mapping rate, a bootstrap-supported phylogenomic tree, and biosynthetic gene cluster content — converge on the same conclusion: strong, multi-method support for the species assignment and for this specific three-strain clade, with consistent inability across the identity- and topology-based methods to resolve a single closest strain within it. This convergence, including a shared limitation, is itself evidence of a robust rather than coincidental result. Two open, explicitly flagged limitations remain for future work: a lower-than-ideal read mapping rate, plausibly attributable to isolate-specific plasmid content absent from the chromosome-only mapping reference; and an inconclusive result for one of three target biosynthetic gene clusters (a class-II lanthipeptide), attributable to the same reference genome's lack of that cluster rather than to the isolate itself. Both limitations trace to the same root cause — the deliberate choice of a reference-based, non-de-novo-assembly workflow — and both point to the same remedy: targeted follow-up (assembly of unmapped reads, or direct PCR/sequencing of the specific loci) rather than a wholesale change of approach. The entirely reference-based workflow — avoiding de novo assembly — proved sufficient to reach genome-scale species and strain-level resolution within the available computational budget, producing a 4.38 Mb consensus genome with internally consistent quality metrics (GC content, depth, Ts/Tv ratio) at every stage.</w:t>
       </w:r>
     </w:p>
     <w:sectPr>

</xml_diff>